<commit_message>
avagraha and TS 7 corr edited
</commit_message>
<xml_diff>
--- a/saMhitA/07/TS 7 Tamil Corrections.docx
+++ b/saMhitA/07/TS 7 Tamil Corrections.docx
@@ -91,7 +91,18 @@
           <w:szCs w:val="32"/>
           <w:u w:val="single"/>
         </w:rPr>
-        <w:t xml:space="preserve">Observed till </w:t>
+        <w:t xml:space="preserve">Observed </w:t>
+      </w:r>
+      <w:proofErr w:type="gramStart"/>
+      <w:r>
+        <w:rPr>
+          <w:b/>
+          <w:bCs/>
+          <w:sz w:val="32"/>
+          <w:szCs w:val="32"/>
+          <w:u w:val="single"/>
+        </w:rPr>
+        <w:t xml:space="preserve">till </w:t>
       </w:r>
       <w:r>
         <w:rPr>
@@ -104,6 +115,7 @@
         </w:rPr>
         <w:t>????</w:t>
       </w:r>
+      <w:proofErr w:type="gramEnd"/>
     </w:p>
     <w:p>
       <w:pPr>
@@ -137,8 +149,8 @@
       </w:tblPr>
       <w:tblGrid>
         <w:gridCol w:w="3452"/>
-        <w:gridCol w:w="5096"/>
-        <w:gridCol w:w="69"/>
+        <w:gridCol w:w="5132"/>
+        <w:gridCol w:w="33"/>
         <w:gridCol w:w="5211"/>
         <w:gridCol w:w="143"/>
         <w:gridCol w:w="46"/>
@@ -157,12 +169,16 @@
               <w:spacing w:before="0" w:line="240" w:lineRule="auto"/>
               <w:jc w:val="center"/>
               <w:rPr>
+                <w:b/>
+                <w:bCs/>
                 <w:sz w:val="32"/>
                 <w:szCs w:val="32"/>
               </w:rPr>
             </w:pPr>
             <w:r>
               <w:rPr>
+                <w:b/>
+                <w:bCs/>
                 <w:sz w:val="32"/>
                 <w:szCs w:val="32"/>
               </w:rPr>
@@ -174,12 +190,16 @@
               <w:spacing w:before="0" w:line="240" w:lineRule="auto"/>
               <w:jc w:val="center"/>
               <w:rPr>
+                <w:b/>
+                <w:bCs/>
                 <w:sz w:val="32"/>
                 <w:szCs w:val="32"/>
               </w:rPr>
             </w:pPr>
             <w:r>
               <w:rPr>
+                <w:b/>
+                <w:bCs/>
                 <w:sz w:val="32"/>
                 <w:szCs w:val="32"/>
               </w:rPr>
@@ -189,19 +209,24 @@
         </w:tc>
         <w:tc>
           <w:tcPr>
-            <w:tcW w:w="5096" w:type="dxa"/>
+            <w:tcW w:w="5165" w:type="dxa"/>
+            <w:gridSpan w:val="2"/>
           </w:tcPr>
           <w:p>
             <w:pPr>
               <w:spacing w:before="0" w:line="240" w:lineRule="auto"/>
               <w:jc w:val="center"/>
               <w:rPr>
+                <w:b/>
+                <w:bCs/>
                 <w:sz w:val="32"/>
                 <w:szCs w:val="32"/>
               </w:rPr>
             </w:pPr>
             <w:r>
               <w:rPr>
+                <w:b/>
+                <w:bCs/>
                 <w:sz w:val="32"/>
                 <w:szCs w:val="32"/>
               </w:rPr>
@@ -211,8 +236,8 @@
         </w:tc>
         <w:tc>
           <w:tcPr>
-            <w:tcW w:w="5423" w:type="dxa"/>
-            <w:gridSpan w:val="3"/>
+            <w:tcW w:w="5354" w:type="dxa"/>
+            <w:gridSpan w:val="2"/>
           </w:tcPr>
           <w:p>
             <w:pPr>
@@ -220,12 +245,16 @@
               <w:ind w:right="-18"/>
               <w:jc w:val="center"/>
               <w:rPr>
+                <w:b/>
+                <w:bCs/>
                 <w:sz w:val="32"/>
                 <w:szCs w:val="32"/>
               </w:rPr>
             </w:pPr>
             <w:r>
               <w:rPr>
+                <w:b/>
+                <w:bCs/>
                 <w:sz w:val="32"/>
                 <w:szCs w:val="32"/>
               </w:rPr>
@@ -293,8 +322,19 @@
                 <w:szCs w:val="28"/>
                 <w:lang w:val="en-IN"/>
               </w:rPr>
-              <w:t>Line No. -  6</w:t>
-            </w:r>
+              <w:t xml:space="preserve">Line No. </w:t>
+            </w:r>
+            <w:proofErr w:type="gramStart"/>
+            <w:r>
+              <w:rPr>
+                <w:b/>
+                <w:sz w:val="28"/>
+                <w:szCs w:val="28"/>
+                <w:lang w:val="en-IN"/>
+              </w:rPr>
+              <w:t>-  6</w:t>
+            </w:r>
+            <w:proofErr w:type="gramEnd"/>
           </w:p>
           <w:p>
             <w:pPr>
@@ -951,7 +991,7 @@
         </w:tc>
         <w:tc>
           <w:tcPr>
-            <w:tcW w:w="5096" w:type="dxa"/>
+            <w:tcW w:w="5132" w:type="dxa"/>
             <w:tcBorders>
               <w:top w:val="single" w:sz="4" w:space="0" w:color="000000"/>
               <w:left w:val="single" w:sz="4" w:space="0" w:color="000000"/>
@@ -1095,7 +1135,7 @@
         </w:tc>
         <w:tc>
           <w:tcPr>
-            <w:tcW w:w="5423" w:type="dxa"/>
+            <w:tcW w:w="5387" w:type="dxa"/>
             <w:gridSpan w:val="3"/>
             <w:tcBorders>
               <w:top w:val="single" w:sz="4" w:space="0" w:color="000000"/>
@@ -1400,7 +1440,7 @@
         </w:tc>
         <w:tc>
           <w:tcPr>
-            <w:tcW w:w="5096" w:type="dxa"/>
+            <w:tcW w:w="5132" w:type="dxa"/>
             <w:tcBorders>
               <w:top w:val="single" w:sz="4" w:space="0" w:color="000000"/>
               <w:left w:val="single" w:sz="4" w:space="0" w:color="000000"/>
@@ -1557,7 +1597,7 @@
         </w:tc>
         <w:tc>
           <w:tcPr>
-            <w:tcW w:w="5423" w:type="dxa"/>
+            <w:tcW w:w="5387" w:type="dxa"/>
             <w:gridSpan w:val="3"/>
             <w:tcBorders>
               <w:top w:val="single" w:sz="4" w:space="0" w:color="000000"/>
@@ -1747,12 +1787,21 @@
               </w:rPr>
               <w:t xml:space="preserve"> </w:t>
             </w:r>
-            <w:r>
-              <w:rPr>
-                <w:b/>
-                <w:bCs/>
-              </w:rPr>
-              <w:t>raatrau)</w:t>
+            <w:proofErr w:type="spellStart"/>
+            <w:r>
+              <w:rPr>
+                <w:b/>
+                <w:bCs/>
+              </w:rPr>
+              <w:t>raatrau</w:t>
+            </w:r>
+            <w:proofErr w:type="spellEnd"/>
+            <w:r>
+              <w:rPr>
+                <w:b/>
+                <w:bCs/>
+              </w:rPr>
+              <w:t>)</w:t>
             </w:r>
           </w:p>
         </w:tc>
@@ -1915,7 +1964,7 @@
         </w:tc>
         <w:tc>
           <w:tcPr>
-            <w:tcW w:w="5096" w:type="dxa"/>
+            <w:tcW w:w="5132" w:type="dxa"/>
             <w:tcBorders>
               <w:top w:val="single" w:sz="4" w:space="0" w:color="000000"/>
               <w:left w:val="single" w:sz="4" w:space="0" w:color="000000"/>
@@ -2041,7 +2090,7 @@
         </w:tc>
         <w:tc>
           <w:tcPr>
-            <w:tcW w:w="5423" w:type="dxa"/>
+            <w:tcW w:w="5387" w:type="dxa"/>
             <w:gridSpan w:val="3"/>
             <w:tcBorders>
               <w:top w:val="single" w:sz="4" w:space="0" w:color="000000"/>
@@ -2361,7 +2410,7 @@
         </w:tc>
         <w:tc>
           <w:tcPr>
-            <w:tcW w:w="5096" w:type="dxa"/>
+            <w:tcW w:w="5132" w:type="dxa"/>
             <w:tcBorders>
               <w:top w:val="single" w:sz="4" w:space="0" w:color="000000"/>
               <w:left w:val="single" w:sz="4" w:space="0" w:color="000000"/>
@@ -2549,7 +2598,7 @@
         </w:tc>
         <w:tc>
           <w:tcPr>
-            <w:tcW w:w="5423" w:type="dxa"/>
+            <w:tcW w:w="5387" w:type="dxa"/>
             <w:gridSpan w:val="3"/>
             <w:tcBorders>
               <w:top w:val="single" w:sz="4" w:space="0" w:color="000000"/>
@@ -2885,7 +2934,7 @@
         </w:tc>
         <w:tc>
           <w:tcPr>
-            <w:tcW w:w="5096" w:type="dxa"/>
+            <w:tcW w:w="5132" w:type="dxa"/>
             <w:tcBorders>
               <w:top w:val="single" w:sz="4" w:space="0" w:color="000000"/>
               <w:left w:val="single" w:sz="4" w:space="0" w:color="000000"/>
@@ -3003,7 +3052,7 @@
         </w:tc>
         <w:tc>
           <w:tcPr>
-            <w:tcW w:w="5423" w:type="dxa"/>
+            <w:tcW w:w="5387" w:type="dxa"/>
             <w:gridSpan w:val="3"/>
             <w:tcBorders>
               <w:top w:val="single" w:sz="4" w:space="0" w:color="000000"/>
@@ -3282,7 +3331,7 @@
         </w:tc>
         <w:tc>
           <w:tcPr>
-            <w:tcW w:w="5096" w:type="dxa"/>
+            <w:tcW w:w="5132" w:type="dxa"/>
             <w:tcBorders>
               <w:top w:val="single" w:sz="4" w:space="0" w:color="000000"/>
               <w:left w:val="single" w:sz="4" w:space="0" w:color="000000"/>
@@ -3541,7 +3590,7 @@
         </w:tc>
         <w:tc>
           <w:tcPr>
-            <w:tcW w:w="5280" w:type="dxa"/>
+            <w:tcW w:w="5244" w:type="dxa"/>
             <w:gridSpan w:val="2"/>
             <w:tcBorders>
               <w:top w:val="single" w:sz="4" w:space="0" w:color="000000"/>
@@ -3841,7 +3890,7 @@
         </w:tc>
         <w:tc>
           <w:tcPr>
-            <w:tcW w:w="5096" w:type="dxa"/>
+            <w:tcW w:w="5132" w:type="dxa"/>
             <w:tcBorders>
               <w:top w:val="single" w:sz="4" w:space="0" w:color="000000"/>
               <w:left w:val="single" w:sz="4" w:space="0" w:color="000000"/>
@@ -3869,7 +3918,7 @@
         </w:tc>
         <w:tc>
           <w:tcPr>
-            <w:tcW w:w="5423" w:type="dxa"/>
+            <w:tcW w:w="5387" w:type="dxa"/>
             <w:gridSpan w:val="3"/>
             <w:tcBorders>
               <w:top w:val="single" w:sz="4" w:space="0" w:color="000000"/>
@@ -3898,18 +3947,6 @@
         </w:tc>
       </w:tr>
     </w:tbl>
-    <w:p>
-      <w:pPr>
-        <w:jc w:val="center"/>
-        <w:rPr>
-          <w:b/>
-          <w:bCs/>
-          <w:sz w:val="32"/>
-          <w:szCs w:val="32"/>
-          <w:u w:val="single"/>
-        </w:rPr>
-      </w:pPr>
-    </w:p>
     <w:p>
       <w:pPr>
         <w:jc w:val="center"/>
@@ -4701,8 +4738,9 @@
                 <w:sz w:val="28"/>
                 <w:szCs w:val="28"/>
               </w:rPr>
-              <w:t xml:space="preserve">Line No. -  </w:t>
-            </w:r>
+              <w:t xml:space="preserve">Line No. </w:t>
+            </w:r>
+            <w:proofErr w:type="gramStart"/>
             <w:r>
               <w:rPr>
                 <w:rFonts w:cs="Arial"/>
@@ -4711,7 +4749,28 @@
                 <w:sz w:val="28"/>
                 <w:szCs w:val="28"/>
               </w:rPr>
-              <w:t>6 &amp; 7</w:t>
+              <w:t xml:space="preserve">-  </w:t>
+            </w:r>
+            <w:r>
+              <w:rPr>
+                <w:rFonts w:cs="Arial"/>
+                <w:b/>
+                <w:bCs/>
+                <w:sz w:val="28"/>
+                <w:szCs w:val="28"/>
+              </w:rPr>
+              <w:t>6</w:t>
+            </w:r>
+            <w:proofErr w:type="gramEnd"/>
+            <w:r>
+              <w:rPr>
+                <w:rFonts w:cs="Arial"/>
+                <w:b/>
+                <w:bCs/>
+                <w:sz w:val="28"/>
+                <w:szCs w:val="28"/>
+              </w:rPr>
+              <w:t xml:space="preserve"> &amp; 7</w:t>
             </w:r>
           </w:p>
           <w:p>
@@ -9976,22 +10035,31 @@
                 <w:sz w:val="32"/>
                 <w:szCs w:val="32"/>
               </w:rPr>
-              <w:t>(it is dee</w:t>
-            </w:r>
+              <w:t xml:space="preserve">(it is </w:t>
+            </w:r>
+            <w:proofErr w:type="spellStart"/>
             <w:r>
               <w:rPr>
                 <w:sz w:val="32"/>
                 <w:szCs w:val="32"/>
               </w:rPr>
-              <w:t>r</w:t>
+              <w:t>dee</w:t>
             </w:r>
             <w:r>
               <w:rPr>
                 <w:sz w:val="32"/>
                 <w:szCs w:val="32"/>
               </w:rPr>
+              <w:t>r</w:t>
+            </w:r>
+            <w:r>
+              <w:rPr>
+                <w:sz w:val="32"/>
+                <w:szCs w:val="32"/>
+              </w:rPr>
               <w:t>gham</w:t>
             </w:r>
+            <w:proofErr w:type="spellEnd"/>
             <w:r>
               <w:rPr>
                 <w:sz w:val="32"/>
@@ -11094,7 +11162,31 @@
                 <w:szCs w:val="32"/>
                 <w:lang w:bidi="ta-IN"/>
               </w:rPr>
-              <w:t xml:space="preserve"> (hrasvam)</w:t>
+              <w:t xml:space="preserve"> (</w:t>
+            </w:r>
+            <w:proofErr w:type="spellStart"/>
+            <w:r>
+              <w:rPr>
+                <w:rFonts w:ascii="Latha" w:hAnsi="Latha" w:cs="Latha"/>
+                <w:b/>
+                <w:bCs/>
+                <w:sz w:val="32"/>
+                <w:szCs w:val="32"/>
+                <w:lang w:bidi="ta-IN"/>
+              </w:rPr>
+              <w:t>hrasvam</w:t>
+            </w:r>
+            <w:proofErr w:type="spellEnd"/>
+            <w:r>
+              <w:rPr>
+                <w:rFonts w:ascii="Latha" w:hAnsi="Latha" w:cs="Latha"/>
+                <w:b/>
+                <w:bCs/>
+                <w:sz w:val="32"/>
+                <w:szCs w:val="32"/>
+                <w:lang w:bidi="ta-IN"/>
+              </w:rPr>
+              <w:t>)</w:t>
             </w:r>
           </w:p>
         </w:tc>
@@ -14768,6 +14860,7 @@
         </w:rPr>
         <w:br w:type="page"/>
       </w:r>
+      <w:proofErr w:type="spellStart"/>
       <w:r>
         <w:rPr>
           <w:b/>
@@ -14797,7 +14890,18 @@
           <w:szCs w:val="32"/>
           <w:u w:val="single"/>
         </w:rPr>
-        <w:t>ya Samhita – TS 7 Tamil co</w:t>
+        <w:t>ya</w:t>
+      </w:r>
+      <w:proofErr w:type="spellEnd"/>
+      <w:r>
+        <w:rPr>
+          <w:b/>
+          <w:bCs/>
+          <w:sz w:val="32"/>
+          <w:szCs w:val="32"/>
+          <w:u w:val="single"/>
+        </w:rPr>
+        <w:t xml:space="preserve"> Samhita – TS 7 Tamil co</w:t>
       </w:r>
       <w:r>
         <w:rPr>
@@ -14924,7 +15028,7 @@
     </w:p>
     <w:tbl>
       <w:tblPr>
-        <w:tblW w:w="13374" w:type="dxa"/>
+        <w:tblW w:w="13050" w:type="dxa"/>
         <w:tblInd w:w="-792" w:type="dxa"/>
         <w:tblBorders>
           <w:top w:val="single" w:sz="4" w:space="0" w:color="000000"/>
@@ -14939,14 +15043,10 @@
       <w:tblGrid>
         <w:gridCol w:w="3092"/>
         <w:gridCol w:w="4738"/>
-        <w:gridCol w:w="5220"/>
-        <w:gridCol w:w="324"/>
+        <w:gridCol w:w="5148"/>
+        <w:gridCol w:w="72"/>
       </w:tblGrid>
       <w:tr>
-        <w:trPr>
-          <w:gridAfter w:val="1"/>
-          <w:wAfter w:w="324" w:type="dxa"/>
-        </w:trPr>
         <w:tc>
           <w:tcPr>
             <w:tcW w:w="3092" w:type="dxa"/>
@@ -15033,6 +15133,7 @@
         <w:tc>
           <w:tcPr>
             <w:tcW w:w="5220" w:type="dxa"/>
+            <w:gridSpan w:val="2"/>
             <w:tcBorders>
               <w:top w:val="single" w:sz="4" w:space="0" w:color="000000"/>
               <w:left w:val="single" w:sz="4" w:space="0" w:color="000000"/>
@@ -15064,10 +15165,6 @@
         </w:tc>
       </w:tr>
       <w:tr>
-        <w:trPr>
-          <w:gridAfter w:val="1"/>
-          <w:wAfter w:w="324" w:type="dxa"/>
-        </w:trPr>
         <w:tc>
           <w:tcPr>
             <w:tcW w:w="3092" w:type="dxa"/>
@@ -15395,6 +15492,7 @@
         <w:tc>
           <w:tcPr>
             <w:tcW w:w="5220" w:type="dxa"/>
+            <w:gridSpan w:val="2"/>
             <w:tcBorders>
               <w:top w:val="single" w:sz="4" w:space="0" w:color="000000"/>
               <w:left w:val="single" w:sz="4" w:space="0" w:color="000000"/>
@@ -15625,10 +15723,6 @@
         </w:tc>
       </w:tr>
       <w:tr>
-        <w:trPr>
-          <w:gridAfter w:val="1"/>
-          <w:wAfter w:w="324" w:type="dxa"/>
-        </w:trPr>
         <w:tc>
           <w:tcPr>
             <w:tcW w:w="3092" w:type="dxa"/>
@@ -15960,6 +16054,7 @@
         <w:tc>
           <w:tcPr>
             <w:tcW w:w="5220" w:type="dxa"/>
+            <w:gridSpan w:val="2"/>
             <w:tcBorders>
               <w:top w:val="single" w:sz="4" w:space="0" w:color="000000"/>
               <w:left w:val="single" w:sz="4" w:space="0" w:color="000000"/>
@@ -16207,10 +16302,6 @@
         </w:tc>
       </w:tr>
       <w:tr>
-        <w:trPr>
-          <w:gridAfter w:val="1"/>
-          <w:wAfter w:w="324" w:type="dxa"/>
-        </w:trPr>
         <w:tc>
           <w:tcPr>
             <w:tcW w:w="3092" w:type="dxa"/>
@@ -16574,6 +16665,7 @@
         <w:tc>
           <w:tcPr>
             <w:tcW w:w="5220" w:type="dxa"/>
+            <w:gridSpan w:val="2"/>
             <w:tcBorders>
               <w:top w:val="single" w:sz="4" w:space="0" w:color="000000"/>
               <w:left w:val="single" w:sz="4" w:space="0" w:color="000000"/>
@@ -16853,10 +16945,6 @@
         </w:tc>
       </w:tr>
       <w:tr>
-        <w:trPr>
-          <w:gridAfter w:val="1"/>
-          <w:wAfter w:w="324" w:type="dxa"/>
-        </w:trPr>
         <w:tc>
           <w:tcPr>
             <w:tcW w:w="3092" w:type="dxa"/>
@@ -17121,6 +17209,7 @@
         <w:tc>
           <w:tcPr>
             <w:tcW w:w="5220" w:type="dxa"/>
+            <w:gridSpan w:val="2"/>
             <w:tcBorders>
               <w:top w:val="single" w:sz="4" w:space="0" w:color="000000"/>
               <w:left w:val="single" w:sz="4" w:space="0" w:color="000000"/>
@@ -17311,8 +17400,6 @@
       </w:tr>
       <w:tr>
         <w:trPr>
-          <w:gridAfter w:val="1"/>
-          <w:wAfter w:w="324" w:type="dxa"/>
           <w:trHeight w:val="1106"/>
         </w:trPr>
         <w:tc>
@@ -17377,8 +17464,19 @@
                 <w:sz w:val="28"/>
                 <w:szCs w:val="28"/>
               </w:rPr>
-              <w:t>1st  Line</w:t>
-            </w:r>
+              <w:t>1</w:t>
+            </w:r>
+            <w:proofErr w:type="gramStart"/>
+            <w:r>
+              <w:rPr>
+                <w:b/>
+                <w:bCs/>
+                <w:sz w:val="28"/>
+                <w:szCs w:val="28"/>
+              </w:rPr>
+              <w:t>st  Line</w:t>
+            </w:r>
+            <w:proofErr w:type="gramEnd"/>
           </w:p>
         </w:tc>
         <w:tc>
@@ -17646,6 +17744,7 @@
         <w:tc>
           <w:tcPr>
             <w:tcW w:w="5220" w:type="dxa"/>
+            <w:gridSpan w:val="2"/>
           </w:tcPr>
           <w:p>
             <w:pPr>
@@ -17922,10 +18021,6 @@
         </w:tc>
       </w:tr>
       <w:tr>
-        <w:trPr>
-          <w:gridAfter w:val="1"/>
-          <w:wAfter w:w="324" w:type="dxa"/>
-        </w:trPr>
         <w:tc>
           <w:tcPr>
             <w:tcW w:w="3092" w:type="dxa"/>
@@ -18261,6 +18356,7 @@
         <w:tc>
           <w:tcPr>
             <w:tcW w:w="5220" w:type="dxa"/>
+            <w:gridSpan w:val="2"/>
             <w:tcBorders>
               <w:top w:val="single" w:sz="4" w:space="0" w:color="000000"/>
               <w:left w:val="single" w:sz="4" w:space="0" w:color="000000"/>
@@ -18543,10 +18639,6 @@
         </w:tc>
       </w:tr>
       <w:tr>
-        <w:trPr>
-          <w:gridAfter w:val="1"/>
-          <w:wAfter w:w="324" w:type="dxa"/>
-        </w:trPr>
         <w:tc>
           <w:tcPr>
             <w:tcW w:w="3092" w:type="dxa"/>
@@ -18753,6 +18845,7 @@
         <w:tc>
           <w:tcPr>
             <w:tcW w:w="5220" w:type="dxa"/>
+            <w:gridSpan w:val="2"/>
           </w:tcPr>
           <w:p>
             <w:pPr>
@@ -18915,10 +19008,6 @@
         </w:tc>
       </w:tr>
       <w:tr>
-        <w:trPr>
-          <w:gridAfter w:val="1"/>
-          <w:wAfter w:w="324" w:type="dxa"/>
-        </w:trPr>
         <w:tc>
           <w:tcPr>
             <w:tcW w:w="3092" w:type="dxa"/>
@@ -19098,6 +19187,7 @@
         <w:tc>
           <w:tcPr>
             <w:tcW w:w="5220" w:type="dxa"/>
+            <w:gridSpan w:val="2"/>
             <w:tcBorders>
               <w:top w:val="single" w:sz="4" w:space="0" w:color="000000"/>
               <w:left w:val="single" w:sz="4" w:space="0" w:color="000000"/>
@@ -19231,6 +19321,10 @@
         </w:tc>
       </w:tr>
       <w:tr>
+        <w:trPr>
+          <w:gridAfter w:val="1"/>
+          <w:wAfter w:w="72" w:type="dxa"/>
+        </w:trPr>
         <w:tc>
           <w:tcPr>
             <w:tcW w:w="3092" w:type="dxa"/>
@@ -19433,8 +19527,7 @@
         </w:tc>
         <w:tc>
           <w:tcPr>
-            <w:tcW w:w="5544" w:type="dxa"/>
-            <w:gridSpan w:val="2"/>
+            <w:tcW w:w="5148" w:type="dxa"/>
           </w:tcPr>
           <w:p>
             <w:pPr>
@@ -19617,6 +19710,7 @@
               </w:rPr>
               <w:t xml:space="preserve"> </w:t>
             </w:r>
+            <w:proofErr w:type="spellStart"/>
             <w:r>
               <w:rPr>
                 <w:sz w:val="28"/>
@@ -19632,6 +19726,7 @@
               </w:rPr>
               <w:t>AÉ</w:t>
             </w:r>
+            <w:proofErr w:type="spellEnd"/>
             <w:r>
               <w:rPr>
                 <w:rFonts w:ascii="BRH Devanagari Extra" w:hAnsi="BRH Devanagari Extra" w:cs="BRH Devanagari Extra"/>
@@ -19644,10 +19739,6 @@
         </w:tc>
       </w:tr>
       <w:tr>
-        <w:trPr>
-          <w:gridAfter w:val="1"/>
-          <w:wAfter w:w="324" w:type="dxa"/>
-        </w:trPr>
         <w:tc>
           <w:tcPr>
             <w:tcW w:w="3092" w:type="dxa"/>
@@ -19942,6 +20033,7 @@
         <w:tc>
           <w:tcPr>
             <w:tcW w:w="5220" w:type="dxa"/>
+            <w:gridSpan w:val="2"/>
             <w:tcBorders>
               <w:top w:val="single" w:sz="4" w:space="0" w:color="000000"/>
               <w:left w:val="single" w:sz="4" w:space="0" w:color="000000"/>
@@ -20180,10 +20272,6 @@
         </w:tc>
       </w:tr>
       <w:tr>
-        <w:trPr>
-          <w:gridAfter w:val="1"/>
-          <w:wAfter w:w="324" w:type="dxa"/>
-        </w:trPr>
         <w:tc>
           <w:tcPr>
             <w:tcW w:w="3092" w:type="dxa"/>
@@ -20518,6 +20606,7 @@
         <w:tc>
           <w:tcPr>
             <w:tcW w:w="5220" w:type="dxa"/>
+            <w:gridSpan w:val="2"/>
             <w:tcBorders>
               <w:top w:val="single" w:sz="4" w:space="0" w:color="000000"/>
               <w:left w:val="single" w:sz="4" w:space="0" w:color="000000"/>
@@ -20798,10 +20887,6 @@
         </w:tc>
       </w:tr>
       <w:tr>
-        <w:trPr>
-          <w:gridAfter w:val="1"/>
-          <w:wAfter w:w="324" w:type="dxa"/>
-        </w:trPr>
         <w:tc>
           <w:tcPr>
             <w:tcW w:w="3092" w:type="dxa"/>
@@ -21224,6 +21309,7 @@
         <w:tc>
           <w:tcPr>
             <w:tcW w:w="5220" w:type="dxa"/>
+            <w:gridSpan w:val="2"/>
             <w:tcBorders>
               <w:top w:val="single" w:sz="4" w:space="0" w:color="000000"/>
               <w:left w:val="single" w:sz="4" w:space="0" w:color="000000"/>
@@ -21604,10 +21690,6 @@
         </w:tc>
       </w:tr>
       <w:tr>
-        <w:trPr>
-          <w:gridAfter w:val="1"/>
-          <w:wAfter w:w="324" w:type="dxa"/>
-        </w:trPr>
         <w:tc>
           <w:tcPr>
             <w:tcW w:w="3092" w:type="dxa"/>
@@ -21843,6 +21925,7 @@
         <w:tc>
           <w:tcPr>
             <w:tcW w:w="5220" w:type="dxa"/>
+            <w:gridSpan w:val="2"/>
             <w:tcBorders>
               <w:top w:val="single" w:sz="4" w:space="0" w:color="000000"/>
               <w:left w:val="single" w:sz="4" w:space="0" w:color="000000"/>
@@ -22109,6 +22192,7 @@
         </w:rPr>
         <w:t>1</w:t>
       </w:r>
+      <w:proofErr w:type="gramStart"/>
       <w:r>
         <w:rPr>
           <w:b/>
@@ -22149,7 +22233,18 @@
           <w:szCs w:val="32"/>
           <w:u w:val="single"/>
         </w:rPr>
-        <w:t xml:space="preserve">January </w:t>
+        <w:t>January</w:t>
+      </w:r>
+      <w:proofErr w:type="gramEnd"/>
+      <w:r>
+        <w:rPr>
+          <w:b/>
+          <w:bCs/>
+          <w:sz w:val="32"/>
+          <w:szCs w:val="32"/>
+          <w:u w:val="single"/>
+        </w:rPr>
+        <w:t xml:space="preserve"> </w:t>
       </w:r>
       <w:r>
         <w:rPr>
@@ -22217,12 +22312,16 @@
               <w:spacing w:before="0" w:line="240" w:lineRule="auto"/>
               <w:jc w:val="center"/>
               <w:rPr>
+                <w:b/>
+                <w:bCs/>
                 <w:sz w:val="32"/>
                 <w:szCs w:val="32"/>
               </w:rPr>
             </w:pPr>
             <w:r>
               <w:rPr>
+                <w:b/>
+                <w:bCs/>
                 <w:sz w:val="32"/>
                 <w:szCs w:val="32"/>
               </w:rPr>
@@ -22234,12 +22333,16 @@
               <w:spacing w:before="0" w:line="240" w:lineRule="auto"/>
               <w:jc w:val="center"/>
               <w:rPr>
+                <w:b/>
+                <w:bCs/>
                 <w:sz w:val="32"/>
                 <w:szCs w:val="32"/>
               </w:rPr>
             </w:pPr>
             <w:r>
               <w:rPr>
+                <w:b/>
+                <w:bCs/>
                 <w:sz w:val="32"/>
                 <w:szCs w:val="32"/>
               </w:rPr>
@@ -22256,12 +22359,16 @@
               <w:spacing w:before="0" w:line="240" w:lineRule="auto"/>
               <w:jc w:val="center"/>
               <w:rPr>
+                <w:b/>
+                <w:bCs/>
                 <w:sz w:val="32"/>
                 <w:szCs w:val="32"/>
               </w:rPr>
             </w:pPr>
             <w:r>
               <w:rPr>
+                <w:b/>
+                <w:bCs/>
                 <w:sz w:val="32"/>
                 <w:szCs w:val="32"/>
               </w:rPr>
@@ -22279,12 +22386,16 @@
               <w:ind w:right="-18"/>
               <w:jc w:val="center"/>
               <w:rPr>
+                <w:b/>
+                <w:bCs/>
                 <w:sz w:val="32"/>
                 <w:szCs w:val="32"/>
               </w:rPr>
             </w:pPr>
             <w:r>
               <w:rPr>
+                <w:b/>
+                <w:bCs/>
                 <w:sz w:val="32"/>
                 <w:szCs w:val="32"/>
               </w:rPr>
@@ -22302,12 +22413,16 @@
             <w:pPr>
               <w:spacing w:before="0" w:line="240" w:lineRule="auto"/>
               <w:rPr>
-                <w:sz w:val="28"/>
-                <w:szCs w:val="28"/>
-              </w:rPr>
-            </w:pPr>
-            <w:r>
-              <w:rPr>
+                <w:b/>
+                <w:bCs/>
+                <w:sz w:val="28"/>
+                <w:szCs w:val="28"/>
+              </w:rPr>
+            </w:pPr>
+            <w:r>
+              <w:rPr>
+                <w:b/>
+                <w:bCs/>
                 <w:sz w:val="28"/>
                 <w:szCs w:val="28"/>
               </w:rPr>
@@ -22315,6 +22430,8 @@
             </w:r>
             <w:r>
               <w:rPr>
+                <w:b/>
+                <w:bCs/>
                 <w:sz w:val="28"/>
                 <w:szCs w:val="28"/>
               </w:rPr>
@@ -22325,12 +22442,16 @@
             <w:pPr>
               <w:spacing w:before="0" w:line="240" w:lineRule="auto"/>
               <w:rPr>
-                <w:sz w:val="28"/>
-                <w:szCs w:val="28"/>
-              </w:rPr>
-            </w:pPr>
-            <w:r>
-              <w:rPr>
+                <w:b/>
+                <w:bCs/>
+                <w:sz w:val="28"/>
+                <w:szCs w:val="28"/>
+              </w:rPr>
+            </w:pPr>
+            <w:r>
+              <w:rPr>
+                <w:b/>
+                <w:bCs/>
                 <w:sz w:val="28"/>
                 <w:szCs w:val="28"/>
               </w:rPr>
@@ -22654,12 +22775,16 @@
             <w:pPr>
               <w:spacing w:before="0" w:line="240" w:lineRule="auto"/>
               <w:rPr>
-                <w:sz w:val="28"/>
-                <w:szCs w:val="28"/>
-              </w:rPr>
-            </w:pPr>
-            <w:r>
-              <w:rPr>
+                <w:b/>
+                <w:bCs/>
+                <w:sz w:val="28"/>
+                <w:szCs w:val="28"/>
+              </w:rPr>
+            </w:pPr>
+            <w:r>
+              <w:rPr>
+                <w:b/>
+                <w:bCs/>
                 <w:sz w:val="28"/>
                 <w:szCs w:val="28"/>
               </w:rPr>
@@ -22667,6 +22792,8 @@
             </w:r>
             <w:r>
               <w:rPr>
+                <w:b/>
+                <w:bCs/>
                 <w:sz w:val="28"/>
                 <w:szCs w:val="28"/>
               </w:rPr>
@@ -22677,12 +22804,16 @@
             <w:pPr>
               <w:spacing w:before="0" w:line="240" w:lineRule="auto"/>
               <w:rPr>
-                <w:sz w:val="28"/>
-                <w:szCs w:val="28"/>
-              </w:rPr>
-            </w:pPr>
-            <w:r>
-              <w:rPr>
+                <w:b/>
+                <w:bCs/>
+                <w:sz w:val="28"/>
+                <w:szCs w:val="28"/>
+              </w:rPr>
+            </w:pPr>
+            <w:r>
+              <w:rPr>
+                <w:b/>
+                <w:bCs/>
                 <w:sz w:val="28"/>
                 <w:szCs w:val="28"/>
               </w:rPr>
@@ -22693,6 +22824,8 @@
             <w:pPr>
               <w:spacing w:before="0" w:line="240" w:lineRule="auto"/>
               <w:rPr>
+                <w:b/>
+                <w:bCs/>
                 <w:sz w:val="28"/>
                 <w:szCs w:val="28"/>
               </w:rPr>
@@ -23003,6 +23136,8 @@
             <w:pPr>
               <w:spacing w:before="0" w:line="240" w:lineRule="auto"/>
               <w:rPr>
+                <w:b/>
+                <w:bCs/>
                 <w:sz w:val="28"/>
                 <w:szCs w:val="28"/>
               </w:rPr>
@@ -23010,6 +23145,8 @@
             <w:r>
               <w:rPr>
                 <w:rFonts w:cs="Latha"/>
+                <w:b/>
+                <w:bCs/>
                 <w:sz w:val="28"/>
                 <w:szCs w:val="28"/>
                 <w:lang w:bidi="ta-IN"/>
@@ -23019,6 +23156,8 @@
             <w:r>
               <w:rPr>
                 <w:rFonts w:cs="Latha"/>
+                <w:b/>
+                <w:bCs/>
                 <w:sz w:val="28"/>
                 <w:szCs w:val="28"/>
                 <w:lang w:bidi="ta-IN"/>
@@ -23027,6 +23166,8 @@
             </w:r>
             <w:r>
               <w:rPr>
+                <w:b/>
+                <w:bCs/>
                 <w:sz w:val="28"/>
                 <w:szCs w:val="28"/>
               </w:rPr>
@@ -23038,13 +23179,17 @@
               <w:spacing w:before="0" w:line="240" w:lineRule="auto"/>
               <w:rPr>
                 <w:rFonts w:cs="Latha"/>
-                <w:sz w:val="28"/>
-                <w:szCs w:val="28"/>
-                <w:lang w:bidi="ta-IN"/>
-              </w:rPr>
-            </w:pPr>
-            <w:r>
-              <w:rPr>
+                <w:b/>
+                <w:bCs/>
+                <w:sz w:val="28"/>
+                <w:szCs w:val="28"/>
+                <w:lang w:bidi="ta-IN"/>
+              </w:rPr>
+            </w:pPr>
+            <w:r>
+              <w:rPr>
+                <w:b/>
+                <w:bCs/>
                 <w:sz w:val="28"/>
                 <w:szCs w:val="28"/>
               </w:rPr>
@@ -23403,6 +23548,8 @@
             <w:pPr>
               <w:spacing w:before="0" w:line="240" w:lineRule="auto"/>
               <w:rPr>
+                <w:b/>
+                <w:bCs/>
                 <w:sz w:val="28"/>
                 <w:szCs w:val="28"/>
               </w:rPr>
@@ -23410,6 +23557,8 @@
             <w:r>
               <w:rPr>
                 <w:rFonts w:cs="Latha"/>
+                <w:b/>
+                <w:bCs/>
                 <w:sz w:val="28"/>
                 <w:szCs w:val="28"/>
                 <w:lang w:bidi="ta-IN"/>
@@ -23419,6 +23568,8 @@
             <w:r>
               <w:rPr>
                 <w:rFonts w:cs="Latha"/>
+                <w:b/>
+                <w:bCs/>
                 <w:sz w:val="28"/>
                 <w:szCs w:val="28"/>
                 <w:lang w:bidi="ta-IN"/>
@@ -23427,6 +23578,8 @@
             </w:r>
             <w:r>
               <w:rPr>
+                <w:b/>
+                <w:bCs/>
                 <w:sz w:val="28"/>
                 <w:szCs w:val="28"/>
               </w:rPr>
@@ -23437,12 +23590,16 @@
             <w:pPr>
               <w:spacing w:before="0" w:line="240" w:lineRule="auto"/>
               <w:rPr>
-                <w:sz w:val="28"/>
-                <w:szCs w:val="28"/>
-              </w:rPr>
-            </w:pPr>
-            <w:r>
-              <w:rPr>
+                <w:b/>
+                <w:bCs/>
+                <w:sz w:val="28"/>
+                <w:szCs w:val="28"/>
+              </w:rPr>
+            </w:pPr>
+            <w:r>
+              <w:rPr>
+                <w:b/>
+                <w:bCs/>
                 <w:sz w:val="28"/>
                 <w:szCs w:val="28"/>
               </w:rPr>
@@ -23455,6 +23612,8 @@
               <w:ind w:left="720" w:hanging="720"/>
               <w:rPr>
                 <w:rFonts w:cs="Latha"/>
+                <w:b/>
+                <w:bCs/>
                 <w:sz w:val="28"/>
                 <w:szCs w:val="28"/>
                 <w:cs/>
@@ -23803,6 +23962,8 @@
             <w:pPr>
               <w:spacing w:before="0" w:line="240" w:lineRule="auto"/>
               <w:rPr>
+                <w:b/>
+                <w:bCs/>
                 <w:sz w:val="28"/>
                 <w:szCs w:val="28"/>
               </w:rPr>
@@ -23810,6 +23971,8 @@
             <w:r>
               <w:rPr>
                 <w:rFonts w:cs="Latha"/>
+                <w:b/>
+                <w:bCs/>
                 <w:sz w:val="28"/>
                 <w:szCs w:val="28"/>
                 <w:lang w:bidi="ta-IN"/>
@@ -23819,6 +23982,8 @@
             <w:r>
               <w:rPr>
                 <w:rFonts w:cs="Latha"/>
+                <w:b/>
+                <w:bCs/>
                 <w:sz w:val="28"/>
                 <w:szCs w:val="28"/>
                 <w:lang w:bidi="ta-IN"/>
@@ -23827,6 +23992,8 @@
             </w:r>
             <w:r>
               <w:rPr>
+                <w:b/>
+                <w:bCs/>
                 <w:sz w:val="28"/>
                 <w:szCs w:val="28"/>
               </w:rPr>
@@ -23839,13 +24006,17 @@
               <w:ind w:left="720" w:hanging="720"/>
               <w:rPr>
                 <w:rFonts w:cs="Latha"/>
-                <w:sz w:val="28"/>
-                <w:szCs w:val="28"/>
-                <w:lang w:bidi="ta-IN"/>
-              </w:rPr>
-            </w:pPr>
-            <w:r>
-              <w:rPr>
+                <w:b/>
+                <w:bCs/>
+                <w:sz w:val="28"/>
+                <w:szCs w:val="28"/>
+                <w:lang w:bidi="ta-IN"/>
+              </w:rPr>
+            </w:pPr>
+            <w:r>
+              <w:rPr>
+                <w:b/>
+                <w:bCs/>
                 <w:sz w:val="28"/>
                 <w:szCs w:val="28"/>
               </w:rPr>
@@ -24142,6 +24313,8 @@
             <w:pPr>
               <w:spacing w:before="0" w:line="240" w:lineRule="auto"/>
               <w:rPr>
+                <w:b/>
+                <w:bCs/>
                 <w:sz w:val="28"/>
                 <w:szCs w:val="28"/>
               </w:rPr>
@@ -24149,6 +24322,8 @@
             <w:r>
               <w:rPr>
                 <w:rFonts w:cs="Latha"/>
+                <w:b/>
+                <w:bCs/>
                 <w:sz w:val="28"/>
                 <w:szCs w:val="28"/>
                 <w:lang w:bidi="ta-IN"/>
@@ -24158,6 +24333,8 @@
             <w:r>
               <w:rPr>
                 <w:rFonts w:cs="Latha"/>
+                <w:b/>
+                <w:bCs/>
                 <w:sz w:val="28"/>
                 <w:szCs w:val="28"/>
                 <w:lang w:bidi="ta-IN"/>
@@ -24166,6 +24343,8 @@
             </w:r>
             <w:r>
               <w:rPr>
+                <w:b/>
+                <w:bCs/>
                 <w:sz w:val="28"/>
                 <w:szCs w:val="28"/>
               </w:rPr>
@@ -24176,12 +24355,16 @@
             <w:pPr>
               <w:spacing w:before="0" w:line="240" w:lineRule="auto"/>
               <w:rPr>
-                <w:sz w:val="28"/>
-                <w:szCs w:val="28"/>
-              </w:rPr>
-            </w:pPr>
-            <w:r>
-              <w:rPr>
+                <w:b/>
+                <w:bCs/>
+                <w:sz w:val="28"/>
+                <w:szCs w:val="28"/>
+              </w:rPr>
+            </w:pPr>
+            <w:r>
+              <w:rPr>
+                <w:b/>
+                <w:bCs/>
                 <w:sz w:val="28"/>
                 <w:szCs w:val="28"/>
               </w:rPr>
@@ -24194,6 +24377,8 @@
               <w:ind w:left="720" w:hanging="720"/>
               <w:rPr>
                 <w:rFonts w:cs="Latha"/>
+                <w:b/>
+                <w:bCs/>
                 <w:sz w:val="28"/>
                 <w:szCs w:val="28"/>
                 <w:lang w:bidi="ta-IN"/>
@@ -24606,6 +24791,7 @@
       <w:pBdr>
         <w:top w:val="single" w:sz="4" w:space="1" w:color="auto"/>
       </w:pBdr>
+      <w:jc w:val="right"/>
       <w:rPr>
         <w:b/>
         <w:bCs/>
@@ -24680,6 +24866,19 @@
         <w:bCs/>
       </w:rPr>
       <w:tab/>
+    </w:r>
+    <w:r>
+      <w:rPr>
+        <w:b/>
+        <w:bCs/>
+      </w:rPr>
+      <w:t xml:space="preserve">           </w:t>
+    </w:r>
+    <w:r>
+      <w:rPr>
+        <w:b/>
+        <w:bCs/>
+      </w:rPr>
       <w:t xml:space="preserve"> </w:t>
     </w:r>
     <w:r>

</xml_diff>